<commit_message>
Sharpen DOCX continued table probe
</commit_message>
<xml_diff>
--- a/tests/Lokad.OoxPdf.Tests/Cases/docx-ladder-03-table-heading-table-keepnext.docx
+++ b/tests/Lokad.OoxPdf.Tests/Cases/docx-ladder-03-table-heading-table-keepnext.docx
@@ -72,25 +72,25 @@
                 <w:rFonts w:ascii="Calibri" w:hAnsi="Calibri"/>
                 <w:sz w:val="18"/>
               </w:rPr>
-              <w:t>AA - BB 1 CC DD</w:t>
-            </w:r>
-          </w:p>
-        </w:tc>
-        <w:tc>
-          <w:tcPr>
-            <w:tcW w:w="1320" w:type="dxa"/>
-            <w:shd w:val="clear" w:fill="F2F2F2"/>
-          </w:tcPr>
-          <w:p>
-            <w:pPr>
-              <w:spacing w:before="36" w:after="0" w:line="276" w:lineRule="auto"/>
-            </w:pPr>
-            <w:r>
-              <w:rPr>
-                <w:rFonts w:ascii="Calibri" w:hAnsi="Calibri"/>
-                <w:sz w:val="18"/>
-              </w:rPr>
-              <w:t>AA - BB 2 CC DD</w:t>
+              <w:t>Fixed (ABC + 6 mo)</w:t>
+            </w:r>
+          </w:p>
+        </w:tc>
+        <w:tc>
+          <w:tcPr>
+            <w:tcW w:w="1320" w:type="dxa"/>
+            <w:shd w:val="clear" w:fill="F2F2F2"/>
+          </w:tcPr>
+          <w:p>
+            <w:pPr>
+              <w:spacing w:before="36" w:after="0" w:line="276" w:lineRule="auto"/>
+            </w:pPr>
+            <w:r>
+              <w:rPr>
+                <w:rFonts w:ascii="Calibri" w:hAnsi="Calibri"/>
+                <w:sz w:val="18"/>
+              </w:rPr>
+              <w:t>Fixed (ABC + 6 mo)</w:t>
             </w:r>
           </w:p>
         </w:tc>
@@ -420,7 +420,7 @@
                 <w:rFonts w:ascii="Calibri" w:hAnsi="Calibri"/>
                 <w:sz w:val="18"/>
               </w:rPr>
-              <w:t>AA - BB 2 CC DD</w:t>
+              <w:t>Fixed (ABC + 6 mo)</w:t>
             </w:r>
           </w:p>
         </w:tc>
@@ -622,7 +622,7 @@
                 <w:rFonts w:ascii="Calibri" w:hAnsi="Calibri"/>
                 <w:sz w:val="18"/>
               </w:rPr>
-              <w:t>AA - BB 1 CC DD</w:t>
+              <w:t>Fixed (ABC + 6 mo)</w:t>
             </w:r>
           </w:p>
         </w:tc>
@@ -750,7 +750,7 @@
                 <w:rFonts w:ascii="Calibri" w:hAnsi="Calibri"/>
                 <w:sz w:val="18"/>
               </w:rPr>
-              <w:t>AA - BB 2 CC DD</w:t>
+              <w:t>Fixed (ABC + 6 mo)</w:t>
             </w:r>
           </w:p>
         </w:tc>
@@ -1080,7 +1080,7 @@
                 <w:rFonts w:ascii="Calibri" w:hAnsi="Calibri"/>
                 <w:sz w:val="18"/>
               </w:rPr>
-              <w:t>AA - BB 2 CC DD</w:t>
+              <w:t>Fixed (ABC + 6 mo)</w:t>
             </w:r>
           </w:p>
         </w:tc>
@@ -1172,7 +1172,7 @@
                 <w:rFonts w:ascii="Calibri" w:hAnsi="Calibri"/>
                 <w:sz w:val="18"/>
               </w:rPr>
-              <w:t>AA - BB 1 CC DD</w:t>
+              <w:t>Fixed (ABC + 6 mo)</w:t>
             </w:r>
           </w:p>
         </w:tc>
@@ -1410,7 +1410,7 @@
                 <w:rFonts w:ascii="Calibri" w:hAnsi="Calibri"/>
                 <w:sz w:val="18"/>
               </w:rPr>
-              <w:t>AA - BB 2 CC DD</w:t>
+              <w:t>Fixed (ABC + 6 mo)</w:t>
             </w:r>
           </w:p>
         </w:tc>
@@ -1722,25 +1722,25 @@
                 <w:rFonts w:ascii="Calibri" w:hAnsi="Calibri"/>
                 <w:sz w:val="18"/>
               </w:rPr>
-              <w:t>AA - BB 1 CC DD</w:t>
-            </w:r>
-          </w:p>
-        </w:tc>
-        <w:tc>
-          <w:tcPr>
-            <w:tcW w:w="1320" w:type="dxa"/>
-            <w:shd w:val="clear" w:fill="F2F2F2"/>
-          </w:tcPr>
-          <w:p>
-            <w:pPr>
-              <w:spacing w:before="36" w:after="0" w:line="276" w:lineRule="auto"/>
-            </w:pPr>
-            <w:r>
-              <w:rPr>
-                <w:rFonts w:ascii="Calibri" w:hAnsi="Calibri"/>
-                <w:sz w:val="18"/>
-              </w:rPr>
-              <w:t>AA - BB 2 CC DD</w:t>
+              <w:t>Fixed (ABC + 6 mo)</w:t>
+            </w:r>
+          </w:p>
+        </w:tc>
+        <w:tc>
+          <w:tcPr>
+            <w:tcW w:w="1320" w:type="dxa"/>
+            <w:shd w:val="clear" w:fill="F2F2F2"/>
+          </w:tcPr>
+          <w:p>
+            <w:pPr>
+              <w:spacing w:before="36" w:after="0" w:line="276" w:lineRule="auto"/>
+            </w:pPr>
+            <w:r>
+              <w:rPr>
+                <w:rFonts w:ascii="Calibri" w:hAnsi="Calibri"/>
+                <w:sz w:val="18"/>
+              </w:rPr>
+              <w:t>Fixed (ABC + 6 mo)</w:t>
             </w:r>
           </w:p>
         </w:tc>
@@ -2070,7 +2070,7 @@
                 <w:rFonts w:ascii="Calibri" w:hAnsi="Calibri"/>
                 <w:sz w:val="18"/>
               </w:rPr>
-              <w:t>AA - BB 2 CC DD</w:t>
+              <w:t>Fixed (ABC + 6 mo)</w:t>
             </w:r>
           </w:p>
         </w:tc>
@@ -2272,7 +2272,7 @@
                 <w:rFonts w:ascii="Calibri" w:hAnsi="Calibri"/>
                 <w:sz w:val="18"/>
               </w:rPr>
-              <w:t>AA - BB 1 CC DD</w:t>
+              <w:t>Fixed (ABC + 6 mo)</w:t>
             </w:r>
           </w:p>
         </w:tc>
@@ -2400,7 +2400,7 @@
                 <w:rFonts w:ascii="Calibri" w:hAnsi="Calibri"/>
                 <w:sz w:val="18"/>
               </w:rPr>
-              <w:t>AA - BB 2 CC DD</w:t>
+              <w:t>Fixed (ABC + 6 mo)</w:t>
             </w:r>
           </w:p>
         </w:tc>
@@ -2730,7 +2730,7 @@
                 <w:rFonts w:ascii="Calibri" w:hAnsi="Calibri"/>
                 <w:sz w:val="18"/>
               </w:rPr>
-              <w:t>AA - BB 2 CC DD</w:t>
+              <w:t>Fixed (ABC + 6 mo)</w:t>
             </w:r>
           </w:p>
         </w:tc>
@@ -2822,7 +2822,7 @@
                 <w:rFonts w:ascii="Calibri" w:hAnsi="Calibri"/>
                 <w:sz w:val="18"/>
               </w:rPr>
-              <w:t>AA - BB 1 CC DD</w:t>
+              <w:t>Fixed (ABC + 6 mo)</w:t>
             </w:r>
           </w:p>
         </w:tc>
@@ -3060,7 +3060,7 @@
                 <w:rFonts w:ascii="Calibri" w:hAnsi="Calibri"/>
                 <w:sz w:val="18"/>
               </w:rPr>
-              <w:t>AA - BB 2 CC DD</w:t>
+              <w:t>Fixed (ABC + 6 mo)</w:t>
             </w:r>
           </w:p>
         </w:tc>
@@ -3372,25 +3372,25 @@
                 <w:rFonts w:ascii="Calibri" w:hAnsi="Calibri"/>
                 <w:sz w:val="18"/>
               </w:rPr>
-              <w:t>AA - BB 1 CC DD</w:t>
-            </w:r>
-          </w:p>
-        </w:tc>
-        <w:tc>
-          <w:tcPr>
-            <w:tcW w:w="1320" w:type="dxa"/>
-            <w:shd w:val="clear" w:fill="F2F2F2"/>
-          </w:tcPr>
-          <w:p>
-            <w:pPr>
-              <w:spacing w:before="36" w:after="0" w:line="276" w:lineRule="auto"/>
-            </w:pPr>
-            <w:r>
-              <w:rPr>
-                <w:rFonts w:ascii="Calibri" w:hAnsi="Calibri"/>
-                <w:sz w:val="18"/>
-              </w:rPr>
-              <w:t>AA - BB 2 CC DD</w:t>
+              <w:t>Fixed (ABC + 6 mo)</w:t>
+            </w:r>
+          </w:p>
+        </w:tc>
+        <w:tc>
+          <w:tcPr>
+            <w:tcW w:w="1320" w:type="dxa"/>
+            <w:shd w:val="clear" w:fill="F2F2F2"/>
+          </w:tcPr>
+          <w:p>
+            <w:pPr>
+              <w:spacing w:before="36" w:after="0" w:line="276" w:lineRule="auto"/>
+            </w:pPr>
+            <w:r>
+              <w:rPr>
+                <w:rFonts w:ascii="Calibri" w:hAnsi="Calibri"/>
+                <w:sz w:val="18"/>
+              </w:rPr>
+              <w:t>Fixed (ABC + 6 mo)</w:t>
             </w:r>
           </w:p>
         </w:tc>

</xml_diff>